<commit_message>
Fill CV and cover letter from certificate details; remove placeholders
Co-Authored-By: Claude Opus 5.5 <noreply@anthropic.com>
Claude-Session: https://claude.ai/code/session_01WDTkzjAq8zGrux37vycPBH
</commit_message>
<xml_diff>
--- a/applications/kvb-adfa-2026/Boniface_Gathee_Cover_Letter.docx
+++ b/applications/kvb-adfa-2026/Boniface_Gathee_Cover_Letter.docx
@@ -22,11 +22,7 @@
         <w:spacing w:after="0" w:line="264"/>
       </w:pPr>
       <w:r>
-        <w:rPr>
-          <w:highlight w:val="yellow"/>
-          <w:highlightCs w:val="yellow"/>
-        </w:rPr>
-        <w:t xml:space="preserve">[P.O. Box ____ – _____, Nairobi]</w:t>
+        <w:t xml:space="preserve">Nairobi, Kenya</w:t>
       </w:r>
     </w:p>
     <w:p>
@@ -34,24 +30,7 @@
         <w:spacing w:after="200" w:line="264"/>
       </w:pPr>
       <w:r>
-        <w:t xml:space="preserve">Tel: </w:t>
-      </w:r>
-      <w:r>
-        <w:rPr>
-          <w:highlight w:val="yellow"/>
-          <w:highlightCs w:val="yellow"/>
-        </w:rPr>
-        <w:t xml:space="preserve">[+254 7__ ___ ___]</w:t>
-      </w:r>
-      <w:r>
-        <w:t xml:space="preserve">  |  Email: </w:t>
-      </w:r>
-      <w:r>
-        <w:rPr>
-          <w:highlight w:val="yellow"/>
-          <w:highlightCs w:val="yellow"/>
-        </w:rPr>
-        <w:t xml:space="preserve">[your.email@example.com]</w:t>
+        <w:t xml:space="preserve">ICPAK Member No. 7753</w:t>
       </w:r>
     </w:p>
     <w:p>
@@ -59,11 +38,7 @@
         <w:spacing w:after="200" w:line="264"/>
       </w:pPr>
       <w:r>
-        <w:rPr>
-          <w:highlight w:val="yellow"/>
-          <w:highlightCs w:val="yellow"/>
-        </w:rPr>
-        <w:t xml:space="preserve">[Date – e.g., 20th October 2026]</w:t>
+        <w:t xml:space="preserve">8th October 2026</w:t>
       </w:r>
     </w:p>
     <w:p>
@@ -87,11 +62,7 @@
         <w:spacing w:after="0" w:line="264"/>
       </w:pPr>
       <w:r>
-        <w:rPr>
-          <w:highlight w:val="yellow"/>
-          <w:highlightCs w:val="yellow"/>
-        </w:rPr>
-        <w:t xml:space="preserve">[Confirm postal address from the advert]</w:t>
+        <w:t xml:space="preserve">P.O. Box 513 – 00605</w:t>
       </w:r>
     </w:p>
     <w:p>
@@ -99,7 +70,7 @@
         <w:spacing w:after="200" w:line="264"/>
       </w:pPr>
       <w:r>
-        <w:t xml:space="preserve">Nairobi</w:t>
+        <w:t xml:space="preserve">Uthiru, Nairobi</w:t>
       </w:r>
     </w:p>
     <w:p>
@@ -129,7 +100,7 @@
         <w:jc w:val="both"/>
       </w:pPr>
       <w:r>
-        <w:t xml:space="preserve">I wish to apply for the position of Assistant Director, Finance and Accounts as advertised by the Kenya Veterinary Board. I am a Certified Public Accountant of Kenya and a registered member of ICPAK in good standing (Reg. No. 7753), holding a Master of Science in Finance from the University of Nairobi and a Bachelor of Commerce (Finance) from KCA University, where I graduated with Second Class Honours, Upper Division.</w:t>
+        <w:t xml:space="preserve">I wish to apply for the position of Assistant Director, Finance and Accounts, Grade KVB 4, as advertised by the Kenya Veterinary Board. I am a Certified Public Accountant of Kenya, having passed the CPA Final Examination in December 2006, and I have been a registered member of the Institute of Certified Public Accountants of Kenya since August 2010 (Registration No. 7753).</w:t>
       </w:r>
     </w:p>
     <w:p>
@@ -138,64 +109,7 @@
         <w:jc w:val="both"/>
       </w:pPr>
       <w:r>
-        <w:t xml:space="preserve">I bring over </w:t>
-      </w:r>
-      <w:r>
-        <w:rPr>
-          <w:highlight w:val="yellow"/>
-          <w:highlightCs w:val="yellow"/>
-        </w:rPr>
-        <w:t xml:space="preserve">[XX]</w:t>
-      </w:r>
-      <w:r>
-        <w:t xml:space="preserve"> years of experience in finance and accounting, </w:t>
-      </w:r>
-      <w:r>
-        <w:rPr>
-          <w:highlight w:val="yellow"/>
-          <w:highlightCs w:val="yellow"/>
-        </w:rPr>
-        <w:t xml:space="preserve">[X]</w:t>
-      </w:r>
-      <w:r>
-        <w:t xml:space="preserve"> of them in a supervisory role. In my current position as </w:t>
-      </w:r>
-      <w:r>
-        <w:rPr>
-          <w:highlight w:val="yellow"/>
-          <w:highlightCs w:val="yellow"/>
-        </w:rPr>
-        <w:t xml:space="preserve">[Job Title]</w:t>
-      </w:r>
-      <w:r>
-        <w:t xml:space="preserve"> at </w:t>
-      </w:r>
-      <w:r>
-        <w:rPr>
-          <w:highlight w:val="yellow"/>
-          <w:highlightCs w:val="yellow"/>
-        </w:rPr>
-        <w:t xml:space="preserve">[Employer]</w:t>
-      </w:r>
-      <w:r>
-        <w:t xml:space="preserve">, I </w:t>
-      </w:r>
-      <w:r>
-        <w:rPr>
-          <w:highlight w:val="yellow"/>
-          <w:highlightCs w:val="yellow"/>
-        </w:rPr>
-        <w:t xml:space="preserve">[lead the finance and accounts function, preparing budgets and annual financial statements, coordinating external audits and ensuring full statutory and tax compliance]</w:t>
-      </w:r>
-      <w:r>
-        <w:t xml:space="preserve">. </w:t>
-      </w:r>
-      <w:r>
-        <w:rPr>
-          <w:highlight w:val="yellow"/>
-          <w:highlightCs w:val="yellow"/>
-        </w:rPr>
-        <w:t xml:space="preserve">[Add one concrete achievement – e.g., “I led the implementation of a new accounting system that reduced month-end closing from 15 to 7 days.”]</w:t>
+        <w:t xml:space="preserve">I hold a Master of Science in Finance from the University of Nairobi (2013) and a Bachelor of Commerce (Finance option) from KCA University (2011), where I graduated with Second Class Honours, Upper Division. Both degrees fall within the disciplines specified in the advertisement. I have further strengthened my analytical skills by earning the Financial Modeling &amp; Valuation Analyst (FMVA®) designation from the Corporate Finance Institute, which equips me to provide sound budgeting, forecasting and decision support to management.</w:t>
       </w:r>
     </w:p>
     <w:p>
@@ -204,27 +118,7 @@
         <w:jc w:val="both"/>
       </w:pPr>
       <w:r>
-        <w:t xml:space="preserve">My Financial Modeling &amp; Valuation Analyst (FMVA®) certification from the Corporate Finance Institute strengthens my ability to provide forecasting, budget analysis and decision support to management. Leadership training at Strathmore Business School, including the New Managers Leadership Program, </w:t>
-      </w:r>
-      <w:r>
-        <w:rPr>
-          <w:highlight w:val="yellow"/>
-          <w:highlightCs w:val="yellow"/>
-        </w:rPr>
-        <w:t xml:space="preserve">[and the (name of 4-week course) at (institution)]</w:t>
-      </w:r>
-      <w:r>
-        <w:t xml:space="preserve">, has equipped me to lead teams, manage performance and contribute to strategy. I am proficient in computer applications, including advanced Microsoft Excel and </w:t>
-      </w:r>
-      <w:r>
-        <w:rPr>
-          <w:highlight w:val="yellow"/>
-          <w:highlightCs w:val="yellow"/>
-        </w:rPr>
-        <w:t xml:space="preserve">[accounting systems, e.g., IFMIS / Sage]</w:t>
-      </w:r>
-      <w:r>
-        <w:t xml:space="preserve">.</w:t>
+        <w:t xml:space="preserve">My leadership and management capability has been developed through executive education at Strathmore Business School, including the New Managers Leadership Program and strategy training. I have also completed customer service training. I am proficient in computer applications, particularly advanced Microsoft Excel and computerised accounting systems.</w:t>
       </w:r>
     </w:p>
     <w:p>
@@ -233,7 +127,7 @@
         <w:jc w:val="both"/>
       </w:pPr>
       <w:r>
-        <w:t xml:space="preserve">I understand the Board’s mandate of regulating veterinary practice and safeguarding animal and public health. I am confident that I can support this mandate by ensuring prudent management of the Board’s resources, timely and accurate reporting in line with the Public Finance Management Act, 2012 and IPSAS, robust internal controls, and clean audit outcomes.</w:t>
+        <w:t xml:space="preserve">I understand the Board’s mandate of regulating veterinary practice and safeguarding animal and public health. If appointed, I will support this mandate by ensuring prudent management of the Board’s resources, timely and accurate financial reporting in line with the Public Finance Management Act, 2012 and IPSAS, robust internal controls, effective budget execution and clean audit outcomes, while leading and developing the finance team.</w:t>
       </w:r>
     </w:p>
     <w:p>
@@ -242,7 +136,7 @@
         <w:jc w:val="both"/>
       </w:pPr>
       <w:r>
-        <w:t xml:space="preserve">Enclosed are my curriculum vitae, CPA(K) certificate, ICPAK membership certificate, leadership course certificate and academic certificates. I meet the requirements of Chapter Six of the Constitution and will avail the relevant clearances on request. I would welcome the opportunity to discuss my application at an interview.</w:t>
+        <w:t xml:space="preserve">Enclosed are my curriculum vitae, CPA(K) certificate, ICPAK membership certificate, leadership course certificate and academic certificates for your consideration. I satisfy the requirements of Chapter Six of the Constitution and will avail the relevant clearances on request. I look forward to the opportunity to discuss my application at an interview.</w:t>
       </w:r>
     </w:p>
     <w:p>

</xml_diff>